<commit_message>
Wersja 1.6 po drugim audycie: pula MiSLOP, reprezentacja grupy, oswiadczenia z par. 5 we wzorze, harmonogram dzialan, umowa (oswiadczenia, zbycie, zal. 4), sprawozdanie, RODO art. 9, zal. 8 bez sankcji
Co-Authored-By: Claude Fable 5.1 <noreply@anthropic.com>
</commit_message>
<xml_diff>
--- a/zrodla/karta-oceny-formalnej.docx
+++ b/zrodla/karta-oceny-formalnej.docx
@@ -380,7 +380,7 @@
           <w:sz w:val="20"/>
           <w:szCs w:val="20"/>
         </w:rPr>
-        <w:t xml:space="preserve">Kartę wypełnia jeden ekspert. Odpowiedź NIE w którymkolwiek wierszu oznacza wezwanie do jednokrotnego uzupełnienia w terminie 3 dni roboczych albo pozostawienie wniosku bez rozpatrzenia, zgodnie z § 13 regulaminu.</w:t>
+        <w:t xml:space="preserve">Kartę wypełnia jeden ekspert. Odpowiedź NIE w wierszach 1 do 18 oznacza wezwanie do jednokrotnego uzupełnienia w terminie 3 dni roboczych albo pozostawienie wniosku bez rozpatrzenia, zgodnie z § 13 regulaminu. Wiersz 19 ma charakter informacyjny.</w:t>
       </w:r>
     </w:p>
     <w:p>
@@ -862,7 +862,7 @@
                 <w:sz w:val="17"/>
                 <w:szCs w:val="17"/>
               </w:rPr>
-              <w:t xml:space="preserve">MiŚLOP, grupa nieformalna, organizacja patronacka</w:t>
+              <w:t xml:space="preserve">MiŚLOP albo grupa nieformalna albo organizacja patronacka</w:t>
             </w:r>
           </w:p>
         </w:tc>
@@ -4084,7 +4084,7 @@
                 <w:sz w:val="20"/>
                 <w:szCs w:val="20"/>
               </w:rPr>
-              <w:t xml:space="preserve">Wskazano numer rachunku bankowego (brak nie jest brakiem formalnym, rachunek uzupełnia się przed podpisaniem umowy, § 18 ust. 7)</w:t>
+              <w:t xml:space="preserve">Wskazano numer rachunku bankowego (brak nie jest brakiem formalnym, rachunek uzupełnia się przed podpisaniem umowy, § 18 ust. 6 i 7)</w:t>
             </w:r>
           </w:p>
         </w:tc>
@@ -4508,13 +4508,12 @@
         </w:tblBorders>
       </w:tblPr>
       <w:tblGrid>
-        <w:gridCol w:w="4535"/>
-        <w:gridCol w:w="4535"/>
+        <w:gridCol w:w="9070"/>
       </w:tblGrid>
       <w:tr>
         <w:tc>
           <w:tcPr>
-            <w:tcW w:type="dxa" w:w="4535"/>
+            <w:tcW w:type="dxa" w:w="9070"/>
             <w:tcBorders>
               <w:top w:val="none"/>
               <w:left w:val="none"/>
@@ -4555,52 +4554,6 @@
                 <w:szCs w:val="19"/>
               </w:rPr>
               <w:t xml:space="preserve">Data i podpis eksperta</w:t>
-            </w:r>
-          </w:p>
-        </w:tc>
-        <w:tc>
-          <w:tcPr>
-            <w:tcW w:type="dxa" w:w="4535"/>
-            <w:tcBorders>
-              <w:top w:val="none"/>
-              <w:left w:val="none"/>
-              <w:bottom w:val="none"/>
-              <w:right w:val="none"/>
-            </w:tcBorders>
-            <w:tcMar>
-              <w:top w:type="dxa" w:w="60"/>
-              <w:left w:type="dxa" w:w="0"/>
-              <w:bottom w:type="dxa" w:w="60"/>
-              <w:right w:type="dxa" w:w="220"/>
-            </w:tcMar>
-          </w:tcPr>
-          <w:p>
-            <w:pPr>
-              <w:spacing w:after="0" w:before="640"/>
-            </w:pPr>
-            <w:r>
-              <w:rPr>
-                <w:sz w:val="22"/>
-                <w:szCs w:val="22"/>
-              </w:rPr>
-              <w:t xml:space="preserve"/>
-            </w:r>
-          </w:p>
-          <w:p>
-            <w:pPr>
-              <w:pBdr>
-                <w:top w:val="single" w:color="1A1712" w:sz="6" w:space="6"/>
-              </w:pBdr>
-              <w:spacing w:after="0"/>
-            </w:pPr>
-            <w:r>
-              <w:rPr>
-                <w:rFonts w:ascii="Lato" w:cs="Lato" w:eastAsia="Lato" w:hAnsi="Lato"/>
-                <w:color w:val="6B6152"/>
-                <w:sz w:val="19"/>
-                <w:szCs w:val="19"/>
-              </w:rPr>
-              <w:t xml:space="preserve">Data i podpis koordynatora oceny</w:t>
             </w:r>
           </w:p>
         </w:tc>

</xml_diff>